<commit_message>
Incluindo a lista de tratamento de erro
</commit_message>
<xml_diff>
--- a/Listas/Lista 02 - Tratamento de texto.docx
+++ b/Listas/Lista 02 - Tratamento de texto.docx
@@ -14,40 +14,35 @@
         <w:rPr>
           <w:rFonts w:ascii="Arial" w:hAnsi="Arial" w:cs="Arial"/>
         </w:rPr>
-        <w:t xml:space="preserve">Considerando o </w:t>
-      </w:r>
-      <w:proofErr w:type="gramStart"/>
-      <w:r>
-        <w:rPr>
-          <w:rFonts w:ascii="Arial" w:hAnsi="Arial" w:cs="Arial"/>
-        </w:rPr>
-        <w:t>texto :</w:t>
-      </w:r>
-      <w:proofErr w:type="gramEnd"/>
-    </w:p>
-    <w:p>
-      <w:pPr>
-        <w:ind w:left="709" w:right="-1"/>
-        <w:jc w:val="both"/>
-        <w:rPr>
-          <w:rFonts w:ascii="Arial" w:hAnsi="Arial" w:cs="Arial"/>
-        </w:rPr>
-      </w:pPr>
-      <w:r>
-        <w:rPr>
-          <w:rFonts w:ascii="Arial" w:hAnsi="Arial" w:cs="Arial"/>
-        </w:rPr>
-        <w:t>“Aprender Python é abrir portas para o futuro. Cada linha de código é um passo rumo ao domínio da tecnologia. Acredite no seu potencial, insista nos desafios e celebre cada conquista. Com dedicação e prática, você vai transformar ideias em soluções reais. Continue, você está no caminho certo.”</w:t>
+        <w:t>Considerando o texto:</w:t>
       </w:r>
     </w:p>
     <w:p>
       <w:pPr>
-        <w:ind w:left="720" w:hanging="360"/>
+        <w:ind w:left="709" w:right="-1"/>
         <w:jc w:val="both"/>
         <w:rPr>
           <w:rFonts w:ascii="Arial" w:hAnsi="Arial" w:cs="Arial"/>
         </w:rPr>
       </w:pPr>
+      <w:r>
+        <w:rPr>
+          <w:rFonts w:ascii="Arial" w:hAnsi="Arial" w:cs="Arial"/>
+        </w:rPr>
+        <w:t xml:space="preserve">“Aprender Python é abrir portas para o futuro. Cada linha de código é um passo rumo ao domínio da tecnologia. Acredite no seu potencial, insista nos desafios e celebre cada conquista. Com dedicação e prática, você vai transformar ideias em soluções reais. </w:t>
+      </w:r>
+      <w:r>
+        <w:rPr>
+          <w:rFonts w:ascii="Arial" w:hAnsi="Arial" w:cs="Arial"/>
+        </w:rPr>
+        <w:t>A TREINARECIFE está aqui para te direcionar e te manter</w:t>
+      </w:r>
+      <w:r>
+        <w:rPr>
+          <w:rFonts w:ascii="Arial" w:hAnsi="Arial" w:cs="Arial"/>
+        </w:rPr>
+        <w:t xml:space="preserve"> no caminho certo.”</w:t>
+      </w:r>
     </w:p>
     <w:p>
       <w:pPr>
@@ -109,8 +104,16 @@
         <w:rPr>
           <w:rFonts w:ascii="Arial" w:hAnsi="Arial" w:cs="Arial"/>
         </w:rPr>
-        <w:t>Mostre a segunda frase com as primeiras letras em maiúculas</w:t>
+        <w:t xml:space="preserve">Mostre a segunda frase com as primeiras letras em </w:t>
       </w:r>
+      <w:proofErr w:type="spellStart"/>
+      <w:r>
+        <w:rPr>
+          <w:rFonts w:ascii="Arial" w:hAnsi="Arial" w:cs="Arial"/>
+        </w:rPr>
+        <w:t>maiúculas</w:t>
+      </w:r>
+      <w:proofErr w:type="spellEnd"/>
     </w:p>
     <w:p>
       <w:pPr>
@@ -153,7 +156,7 @@
         <w:rPr>
           <w:rFonts w:ascii="Arial" w:hAnsi="Arial" w:cs="Arial"/>
         </w:rPr>
-        <w:t>Mostre a listas de palavras distintas existente no texto (considere os acentos, mas desconsidere a case) em ordem alfabética</w:t>
+        <w:t>Mostre a lista de palavras distintas existente no texto (considere os acentos, mas desconsidere a case) em ordem alfabética</w:t>
       </w:r>
     </w:p>
     <w:p>
@@ -210,7 +213,19 @@
         <w:rPr>
           <w:rFonts w:ascii="Arial" w:hAnsi="Arial" w:cs="Arial"/>
         </w:rPr>
-        <w:t>Quantas caracteres tem no texto</w:t>
+        <w:t>Quant</w:t>
+      </w:r>
+      <w:r>
+        <w:rPr>
+          <w:rFonts w:ascii="Arial" w:hAnsi="Arial" w:cs="Arial"/>
+        </w:rPr>
+        <w:t>o</w:t>
+      </w:r>
+      <w:r>
+        <w:rPr>
+          <w:rFonts w:ascii="Arial" w:hAnsi="Arial" w:cs="Arial"/>
+        </w:rPr>
+        <w:t>s caracteres tem no texto</w:t>
       </w:r>
     </w:p>
     <w:p>

</xml_diff>